<commit_message>
courts: Times New Roman where the rules name no face and the exemplar is Times (fb-9fyu)
California Courts of Appeal 5th (amicus, answering, motion, writ), 4th (amicus) and 6th (answering,
motion, writ): EB Garamond -> Times New Roman (CRC 8.204(b)(2) allows any conventional font; the
exemplars are Times New Roman; docs/FONTS.md rule 6). Mississippi Supreme Court amicus and BAP 1st
Cir. reply: Liberation Serif -> Times New Roman (rule 3). latex/docx regenerated (fb engines gen),
every engine re-rendered and checked green.

Co-Authored-By: Claude Opus 5.5 <noreply@anthropic.com>
</commit_message>
<xml_diff>
--- a/courts/first-circuit/bankruptcy-appellate-panel/reply-brief/usage/OUTPUT-reply-brief.docx
+++ b/courts/first-circuit/bankruptcy-appellate-panel/reply-brief/usage/OUTPUT-reply-brief.docx
@@ -18,9 +18,7 @@
         <w:t xml:space="preserve"> </w:t>
       </w:r>
       <w:r>
-        <w:t xml:space="preserve">23</w:t>
-        <w:noBreakHyphen/>
-        <w:t xml:space="preserve">025</w:t>
+        <w:t xml:space="preserve">23-⁠025</w:t>
       </w:r>
     </w:p>
     <w:p>
@@ -53,9 +51,7 @@
         <w:t xml:space="preserve">Bankruptcy Case No. </w:t>
       </w:r>
       <w:r>
-        <w:t xml:space="preserve">23</w:t>
-        <w:noBreakHyphen/>
-        <w:t xml:space="preserve">10366-BAH</w:t>
+        <w:t xml:space="preserve">23-⁠10366-BAH</w:t>
       </w:r>
     </w:p>
     <w:p>
@@ -439,11 +435,7 @@
           <w:i/>
           <w:iCs/>
         </w:rPr>
-        <w:t xml:space="preserve">(603)</w:t>
-        <w:noBreakHyphen/>
-        <w:t xml:space="preserve">898</w:t>
-        <w:noBreakHyphen/>
-        <w:t xml:space="preserve">5210</w:t>
+        <w:t xml:space="preserve">(603)-⁠898-⁠5210</w:t>
       </w:r>
     </w:p>
     <w:p>
@@ -461,11 +453,7 @@
         <w:t xml:space="preserve">Telephone: </w:t>
       </w:r>
       <w:r>
-        <w:t xml:space="preserve">(603)</w:t>
-        <w:noBreakHyphen/>
-        <w:t xml:space="preserve">898</w:t>
-        <w:noBreakHyphen/>
-        <w:t xml:space="preserve">4383</w:t>
+        <w:t xml:space="preserve">(603)-⁠898-⁠4383</w:t>
       </w:r>
     </w:p>
     <w:p>
@@ -1241,9 +1229,7 @@
         <w:t xml:space="preserve"> </w:t>
       </w:r>
       <w:r>
-        <w:t xml:space="preserve">22</w:t>
-        <w:noBreakHyphen/>
-        <w:t xml:space="preserve">10117-MAF,</w:t>
+        <w:t xml:space="preserve">22-⁠10117-MAF,</w:t>
       </w:r>
       <w:r>
         <w:t xml:space="preserve"> </w:t>
@@ -1261,9 +1247,7 @@
         <w:t xml:space="preserve"> </w:t>
       </w:r>
       <w:r>
-        <w:t xml:space="preserve">23</w:t>
-        <w:noBreakHyphen/>
-        <w:t xml:space="preserve">004</w:t>
+        <w:t xml:space="preserve">23-⁠004</w:t>
       </w:r>
       <w:r>
         <w:t xml:space="preserve"> </w:t>
@@ -2432,13 +2416,7 @@
         <w:pStyle w:val="BAPFirst"/>
       </w:pPr>
       <w:r>
-        <w:t xml:space="preserve">Appellant states that the documents are in the record. In fact, those three documents were filed by Appellee as Exhibit C in his Adversary Complaint, Robert Ansin v. Christine Marie Ansin (Adv. Pro. 23</w:t>
-      </w:r>
-      <w:r>
-        <w:noBreakHyphen/>
-      </w:r>
-      <w:r>
-        <w:t xml:space="preserve">01011-BAH), which is part of the docket, and is appropriately included in accordance with Fed. R. Bankr. P. 8009(a)⁠(4).</w:t>
+        <w:t xml:space="preserve">Appellant states that the documents are in the record. In fact, those three documents were filed by Appellee as Exhibit C in his Adversary Complaint, Robert Ansin v. Christine Marie Ansin (Adv. Pro. 23-⁠01011-BAH), which is part of the docket, and is appropriately included in accordance with Fed. R. Bankr. P. 8009(a)⁠(4).</w:t>
       </w:r>
     </w:p>
     <w:p>
@@ -3480,11 +3458,7 @@
           <w:i/>
           <w:iCs/>
         </w:rPr>
-        <w:t xml:space="preserve">Tel-(603)</w:t>
-        <w:noBreakHyphen/>
-        <w:t xml:space="preserve">898</w:t>
-        <w:noBreakHyphen/>
-        <w:t xml:space="preserve">4383</w:t>
+        <w:t xml:space="preserve">Tel-(603)-⁠898-⁠4383</w:t>
       </w:r>
     </w:p>
     <w:p>
@@ -3519,7 +3493,7 @@
         <w:ind w:left="0" w:firstLine="720"/>
       </w:pPr>
       <w:r>
-        <w:t xml:space="preserve">This brief complies with the typeface and type-style requirements of Fed. R. Bankr. P. 8015(a)⁠(5) and (6) because it has been prepared in a proportionally spaced typeface, Liberation Serif 14-point, using the vendored font.</w:t>
+        <w:t xml:space="preserve">This brief complies with the typeface and type-style requirements of Fed. R. Bankr. P. 8015(a)⁠(5) and (6) because it has been prepared in a proportionally spaced typeface, Times New Roman 14-point, using the vendored font.</w:t>
       </w:r>
     </w:p>
     <w:p>
@@ -3661,9 +3635,7 @@
         <w:t xml:space="preserve"> </w:t>
       </w:r>
       <w:r>
-        <w:t xml:space="preserve">23</w:t>
-        <w:noBreakHyphen/>
-        <w:t xml:space="preserve">025</w:t>
+        <w:t xml:space="preserve">23-⁠025</w:t>
       </w:r>
     </w:p>
     <w:p>
@@ -3678,9 +3650,7 @@
         <w:t xml:space="preserve">Bankruptcy Case No. </w:t>
       </w:r>
       <w:r>
-        <w:t xml:space="preserve">23</w:t>
-        <w:noBreakHyphen/>
-        <w:t xml:space="preserve">10366-BAH</w:t>
+        <w:t xml:space="preserve">23-⁠10366-BAH</w:t>
       </w:r>
     </w:p>
     <w:p>
@@ -3822,9 +3792,7 @@
         <w:jc w:val="center"/>
       </w:pPr>
       <w:r>
-        <w:t xml:space="preserve">1st Cir. BAP L.R. 8014</w:t>
-        <w:noBreakHyphen/>
-        <w:t xml:space="preserve">1(a)⁠(2)</w:t>
+        <w:t xml:space="preserve">1st Cir. BAP L.R. 8014-⁠1(a)⁠(2)</w:t>
       </w:r>
     </w:p>
     <w:p>
@@ -3862,9 +3830,7 @@
         <w:tab/>
       </w:r>
       <w:r>
-        <w:t xml:space="preserve">The undersigned certifies that the undersigned knows of no related cases or appeals as that term is defined in 1st Cir. BAP L.R. 8014</w:t>
-        <w:noBreakHyphen/>
-        <w:t xml:space="preserve">1(a)⁠(2)⁠(A).</w:t>
+        <w:t xml:space="preserve">The undersigned certifies that the undersigned knows of no related cases or appeals as that term is defined in 1st Cir. BAP L.R. 8014-⁠1(a)⁠(2)⁠(A).</w:t>
       </w:r>
     </w:p>
     <w:p>
@@ -3978,11 +3944,7 @@
         <w:jc w:val="left"/>
       </w:pPr>
       <w:r>
-        <w:t xml:space="preserve">Tel-(603)</w:t>
-        <w:noBreakHyphen/>
-        <w:t xml:space="preserve">898</w:t>
-        <w:noBreakHyphen/>
-        <w:t xml:space="preserve">4383</w:t>
+        <w:t xml:space="preserve">Tel-(603)-⁠898-⁠4383</w:t>
       </w:r>
     </w:p>
     <w:p>
@@ -4054,9 +4016,7 @@
         <w:t xml:space="preserve"> </w:t>
       </w:r>
       <w:r>
-        <w:t xml:space="preserve">23</w:t>
-        <w:noBreakHyphen/>
-        <w:t xml:space="preserve">025</w:t>
+        <w:t xml:space="preserve">23-⁠025</w:t>
       </w:r>
     </w:p>
     <w:p>
@@ -4071,9 +4031,7 @@
         <w:t xml:space="preserve">Bankruptcy Case No. </w:t>
       </w:r>
       <w:r>
-        <w:t xml:space="preserve">23</w:t>
-        <w:noBreakHyphen/>
-        <w:t xml:space="preserve">10366-BAH</w:t>
+        <w:t xml:space="preserve">23-⁠10366-BAH</w:t>
       </w:r>
     </w:p>
     <w:p>
@@ -4215,9 +4173,7 @@
         <w:jc w:val="center"/>
       </w:pPr>
       <w:r>
-        <w:t xml:space="preserve">1st Cir. BAP L.R. 8014</w:t>
-        <w:noBreakHyphen/>
-        <w:t xml:space="preserve">1(a)⁠(3)</w:t>
+        <w:t xml:space="preserve">1st Cir. BAP L.R. 8014-⁠1(a)⁠(3)</w:t>
       </w:r>
     </w:p>
     <w:p>
@@ -4255,9 +4211,7 @@
         <w:tab/>
       </w:r>
       <w:r>
-        <w:t xml:space="preserve">The undersigned certifies that the undersigned knows of no interested party as that term is defined in 1st Cir. BAP L.R. 8014</w:t>
-        <w:noBreakHyphen/>
-        <w:t xml:space="preserve">1(a)⁠(3)⁠(A).</w:t>
+        <w:t xml:space="preserve">The undersigned certifies that the undersigned knows of no interested party as that term is defined in 1st Cir. BAP L.R. 8014-⁠1(a)⁠(3)⁠(A).</w:t>
       </w:r>
     </w:p>
     <w:p>
@@ -4371,11 +4325,7 @@
         <w:jc w:val="left"/>
       </w:pPr>
       <w:r>
-        <w:t xml:space="preserve">Tel-(603)</w:t>
-        <w:noBreakHyphen/>
-        <w:t xml:space="preserve">898</w:t>
-        <w:noBreakHyphen/>
-        <w:t xml:space="preserve">4383</w:t>
+        <w:t xml:space="preserve">Tel-(603)-⁠898-⁠4383</w:t>
       </w:r>
     </w:p>
     <w:p>
@@ -4616,7 +4566,7 @@
   <w:docDefaults>
     <w:rPrDefault>
       <w:rPr>
-        <w:rFonts w:ascii="Liberation Serif" w:hAnsi="Liberation Serif" w:eastAsia="Liberation Serif" w:cs="Liberation Serif"/>
+        <w:rFonts w:ascii="Times New Roman" w:hAnsi="Times New Roman" w:eastAsia="Times New Roman" w:cs="Times New Roman"/>
         <w:sz w:val="28"/>
         <w:szCs w:val="28"/>
         <w:lang w:val="en-US" w:eastAsia="zh-CN" w:bidi="ar-SA"/>
@@ -4808,7 +4758,7 @@
       <w:outlineLvl w:val="0"/>
     </w:pPr>
     <w:rPr>
-      <w:rFonts w:ascii="Liberation Serif" w:hAnsi="Liberation Serif" w:eastAsia="Liberation Serif" w:cs="Liberation Serif"/>
+      <w:rFonts w:ascii="Times New Roman" w:hAnsi="Times New Roman" w:eastAsia="Times New Roman" w:cs="Times New Roman"/>
       <w:b/>
       <w:bCs/>
       <w:caps/>
@@ -4835,7 +4785,7 @@
       <w:outlineLvl w:val="1"/>
     </w:pPr>
     <w:rPr>
-      <w:rFonts w:ascii="Liberation Serif" w:hAnsi="Liberation Serif" w:eastAsia="Liberation Serif" w:cs="Liberation Serif"/>
+      <w:rFonts w:ascii="Times New Roman" w:hAnsi="Times New Roman" w:eastAsia="Times New Roman" w:cs="Times New Roman"/>
       <w:b/>
       <w:bCs/>
       <w:color w:val="000000"/>
@@ -4861,7 +4811,7 @@
       <w:outlineLvl w:val="2"/>
     </w:pPr>
     <w:rPr>
-      <w:rFonts w:ascii="Liberation Serif" w:hAnsi="Liberation Serif" w:eastAsia="Liberation Serif" w:cs="Liberation Serif"/>
+      <w:rFonts w:ascii="Times New Roman" w:hAnsi="Times New Roman" w:eastAsia="Times New Roman" w:cs="Times New Roman"/>
       <w:b/>
       <w:bCs/>
       <w:color w:val="000000"/>
@@ -4887,7 +4837,7 @@
       <w:outlineLvl w:val="3"/>
     </w:pPr>
     <w:rPr>
-      <w:rFonts w:ascii="Liberation Serif" w:hAnsi="Liberation Serif" w:eastAsia="Liberation Serif" w:cs="Liberation Serif"/>
+      <w:rFonts w:ascii="Times New Roman" w:hAnsi="Times New Roman" w:eastAsia="Times New Roman" w:cs="Times New Roman"/>
       <w:b/>
       <w:bCs/>
       <w:i/>
@@ -4914,7 +4864,7 @@
       <w:outlineLvl w:val="4"/>
     </w:pPr>
     <w:rPr>
-      <w:rFonts w:ascii="Liberation Serif" w:hAnsi="Liberation Serif" w:eastAsia="Liberation Serif" w:cs="Liberation Serif"/>
+      <w:rFonts w:ascii="Times New Roman" w:hAnsi="Times New Roman" w:eastAsia="Times New Roman" w:cs="Times New Roman"/>
       <w:b/>
       <w:bCs/>
       <w:i/>

</xml_diff>